<commit_message>
feat(bieu-mau): Mẫu 09C, 9D nhập theo trục đúng biểu mẫu gốc
- Nhiệm vụ và kết quả theo trục nhập một lần trên phiếu tự chấm (AxisReports, jsonb theo mã trục): nhiệm vụ kèm mức tự đánh
  giá và ý con "+" in ở mục I Mẫu 09C; dòng tóm tắt mỗi trục (tình hình, sản phẩm, tiến độ, thời hạn, ghi chú) là một dòng Mẫu 9D.
- Mẫu 9D đúng 6 dòng "Trục n" như biểu mẫu gốc; Mẫu 09C mục I: câu dẫn, nhận xét chung, rồi mỗi trục một tiêu đề đậm và mỗi
  nhiệm vụ một đoạn; bỏ dòng lưu ý hướng dẫn viết (chữ đỏ) khỏi bản in.
- Giới hạn ký tự mục I tính cả phần nhiệm vụ theo trục; màn hình tự chấm có xem trước mục I.
- Migration ReplaceTaskResultsWithAxisReports: đổi cột TaskResults → AxisReports, không chuyển dữ liệu 9D dạng cũ.
- Template dựng lại bằng tools/templates/build_axis_reports.py; tài liệu docs/bieu-mau.md cập nhật tag.
</commit_message>
<xml_diff>
--- a/backend/src/CongTacDang.Infrastructure/Templates/Word/Mau_09C_BanTuDanhGia.docx
+++ b/backend/src/CongTacDang.Infrastructure/Templates/Word/Mau_09C_BanTuDanhGia.docx
@@ -811,156 +811,129 @@
             </w:sdtContent>
           </w:sdt>
         </w:p>
-        <w:p>
-          <w:pPr>
-            <w:spacing w:after="0" w:line="240" w:lineRule="auto"/>
-            <w:ind w:firstLine="709"/>
-            <w:rPr>
-              <w:sz w:val="28"/>
-              <w:szCs w:val="28"/>
-              <w:lang w:val="en-US" w:eastAsia="en-US"/>
-            </w:rPr>
-          </w:pPr>
-          <w:sdt>
-            <w:sdtPr>
-              <w:alias w:val="S_CONTENT"/>
-              <w:tag w:val="S_CONTENT"/>
-              <w:id w:val="923012"/>
-            </w:sdtPr>
-            <w:sdtContent>
-              <w:r>
+        <w:sdt>
+          <w:sdtPr>
+            <w:alias w:val="if:S_SHOW_CONTENT"/>
+            <w:tag w:val="if:S_SHOW_CONTENT"/>
+            <w:id w:val="923020"/>
+          </w:sdtPr>
+          <w:sdtContent>
+            <w:p>
+              <w:pPr>
+                <w:spacing w:after="0" w:line="240" w:lineRule="auto"/>
+                <w:ind w:firstLine="709"/>
                 <w:rPr>
                   <w:sz w:val="28"/>
                   <w:szCs w:val="28"/>
                   <w:lang w:val="en-US" w:eastAsia="en-US"/>
                 </w:rPr>
-                <w:t>.</w:t>
-              </w:r>
-              <w:r>
+              </w:pPr>
+              <w:sdt>
+                <w:sdtPr>
+                  <w:alias w:val="S_CONTENT"/>
+                  <w:tag w:val="S_CONTENT"/>
+                  <w:id w:val="923012"/>
+                </w:sdtPr>
+                <w:sdtContent>
+                  <w:r>
+                    <w:rPr>
+                      <w:sz w:val="28"/>
+                      <w:szCs w:val="28"/>
+                      <w:lang w:val="en-US" w:eastAsia="en-US"/>
+                    </w:rPr>
+                    <w:t>.</w:t>
+                  </w:r>
+                  <w:r>
+                    <w:rPr>
+                      <w:sz w:val="28"/>
+                      <w:szCs w:val="28"/>
+                      <w:lang w:eastAsia="en-US"/>
+                    </w:rPr>
+                    <w:t>………………………………………………………………………………..</w:t>
+                  </w:r>
+                </w:sdtContent>
+              </w:sdt>
+            </w:p>
+          </w:sdtContent>
+        </w:sdt>
+        <w:sdt>
+          <w:sdtPr>
+            <w:alias w:val="repeat:S_AXES"/>
+            <w:tag w:val="repeat:S_AXES"/>
+            <w:id w:val="923024"/>
+          </w:sdtPr>
+          <w:sdtContent>
+            <w:p>
+              <w:pPr>
+                <w:spacing w:after="0" w:line="240" w:lineRule="auto"/>
+                <w:ind w:firstLine="709"/>
                 <w:rPr>
+                  <w:b/>
+                  <w:bCs/>
                   <w:sz w:val="28"/>
                   <w:szCs w:val="28"/>
                   <w:lang w:eastAsia="en-US"/>
                 </w:rPr>
-                <w:t>………………………………………………………………………………..</w:t>
-              </w:r>
-            </w:sdtContent>
-          </w:sdt>
-        </w:p>
-        <w:p>
-          <w:pPr>
-            <w:spacing w:after="0" w:line="240" w:lineRule="auto"/>
-            <w:ind w:firstLine="709"/>
-            <w:rPr>
-              <w:i/>
-              <w:iCs/>
-              <w:color w:val="EE0000"/>
-              <w:sz w:val="20"/>
-              <w:szCs w:val="20"/>
-              <w:lang w:eastAsia="en-US"/>
-            </w:rPr>
-          </w:pPr>
-          <w:sdt>
-            <w:sdtPr>
-              <w:alias w:val="S_NOTE"/>
-              <w:tag w:val="S_NOTE"/>
-              <w:id w:val="923013"/>
-            </w:sdtPr>
-            <w:sdtContent>
-              <w:r>
-                <w:rPr>
-                  <w:i/>
-                  <w:iCs/>
-                  <w:color w:val="EE0000"/>
-                  <w:sz w:val="20"/>
-                  <w:szCs w:val="20"/>
-                  <w:lang w:eastAsia="en-US"/>
-                </w:rPr>
-                <w:t>(Lưu ý: Viết tóm tắt theo kết quả 6 trục</w:t>
-              </w:r>
-              <w:r>
-                <w:rPr>
-                  <w:i/>
-                  <w:iCs/>
-                  <w:color w:val="EE0000"/>
-                  <w:sz w:val="20"/>
-                  <w:szCs w:val="20"/>
-                  <w:lang w:val="en-US" w:eastAsia="en-US"/>
-                </w:rPr>
-                <w:t>.</w:t>
-              </w:r>
-              <w:r>
-                <w:rPr>
-                  <w:i/>
-                  <w:iCs/>
-                  <w:color w:val="EE0000"/>
-                  <w:sz w:val="20"/>
-                  <w:szCs w:val="20"/>
-                  <w:lang w:eastAsia="en-US"/>
-                </w:rPr>
-                <w:t xml:space="preserve"> </w:t>
-              </w:r>
-              <w:r>
-                <w:rPr>
-                  <w:i/>
-                  <w:iCs/>
-                  <w:color w:val="EE0000"/>
-                  <w:sz w:val="20"/>
-                  <w:szCs w:val="20"/>
-                  <w:lang w:val="en-US" w:eastAsia="en-US"/>
-                </w:rPr>
-                <w:t>Đ</w:t>
-              </w:r>
-              <w:r>
-                <w:rPr>
-                  <w:i/>
-                  <w:iCs/>
-                  <w:color w:val="EE0000"/>
-                  <w:sz w:val="20"/>
-                  <w:szCs w:val="20"/>
-                  <w:lang w:eastAsia="en-US"/>
-                </w:rPr>
-                <w:t xml:space="preserve">ối với nhiệm vụ trọng tâm, then chốt, </w:t>
-              </w:r>
-              <w:r>
-                <w:rPr>
-                  <w:b/>
-                  <w:bCs/>
-                  <w:i/>
-                  <w:iCs/>
-                  <w:color w:val="EE0000"/>
-                  <w:sz w:val="20"/>
-                  <w:szCs w:val="20"/>
-                  <w:u w:val="single"/>
-                  <w:lang w:eastAsia="en-US"/>
-                </w:rPr>
-                <w:t>nhất là</w:t>
-              </w:r>
-              <w:r>
-                <w:rPr>
-                  <w:i/>
-                  <w:iCs/>
-                  <w:color w:val="EE0000"/>
-                  <w:sz w:val="20"/>
-                  <w:szCs w:val="20"/>
-                  <w:lang w:eastAsia="en-US"/>
-                </w:rPr>
-                <w:t xml:space="preserve"> nhiệm vụ an toàn, an ninh, chất lượng, khai thác, tài chính, đầu tư, dự án và pháp chế, phải kết luận rõ chất lượng sản phẩm, hiệu quả thực hiện nhiệm vụ theo 01 trong 03 mức: Mức 1-Chủ động tiếp cận, giải quyết hiệu quả vấn đề, có kết quả cụ thể; Mức 2-Cơ bản đáp ứng yêu cầu nhưng còn hạn chế, cần tiếp tục hoàn thiện; Mức 3-Không đáp ứng yêu cầu nhiệm vụ</w:t>
-              </w:r>
-              <w:r>
-                <w:rPr>
-                  <w:i/>
-                  <w:iCs/>
-                  <w:color w:val="EE0000"/>
-                  <w:sz w:val="20"/>
-                  <w:szCs w:val="20"/>
-                  <w:lang w:val="en-US" w:eastAsia="en-US"/>
-                </w:rPr>
-                <w:t>)</w:t>
-              </w:r>
-            </w:sdtContent>
-          </w:sdt>
-        </w:p>
+              </w:pPr>
+              <w:sdt>
+                <w:sdtPr>
+                  <w:alias w:val="AX_TITLE"/>
+                  <w:tag w:val="AX_TITLE"/>
+                  <w:id w:val="923021"/>
+                </w:sdtPr>
+                <w:sdtContent>
+                  <w:r>
+                    <w:rPr>
+                      <w:b/>
+                      <w:bCs/>
+                      <w:sz w:val="28"/>
+                      <w:szCs w:val="28"/>
+                      <w:lang w:eastAsia="en-US"/>
+                    </w:rPr>
+                    <w:t xml:space="preserve">1. Tên trục</w:t>
+                  </w:r>
+                </w:sdtContent>
+              </w:sdt>
+            </w:p>
+            <w:sdt>
+              <w:sdtPr>
+                <w:alias w:val="repeat:AX_LINES"/>
+                <w:tag w:val="repeat:AX_LINES"/>
+                <w:id w:val="923023"/>
+              </w:sdtPr>
+              <w:sdtContent>
+                <w:p>
+                  <w:pPr>
+                    <w:spacing w:after="0" w:line="240" w:lineRule="auto"/>
+                    <w:ind w:firstLine="709"/>
+                    <w:rPr>
+                      <w:sz w:val="28"/>
+                      <w:szCs w:val="28"/>
+                      <w:lang w:val="en-US" w:eastAsia="en-US"/>
+                    </w:rPr>
+                  </w:pPr>
+                  <w:sdt>
+                    <w:sdtPr>
+                      <w:alias w:val="L_TEXT"/>
+                      <w:tag w:val="L_TEXT"/>
+                      <w:id w:val="923022"/>
+                    </w:sdtPr>
+                    <w:sdtContent>
+                      <w:r>
+                        <w:rPr>
+                          <w:sz w:val="28"/>
+                          <w:szCs w:val="28"/>
+                          <w:lang w:val="en-US" w:eastAsia="en-US"/>
+                        </w:rPr>
+                        <w:t xml:space="preserve">Nhiệm vụ 1: …</w:t>
+                      </w:r>
+                    </w:sdtContent>
+                  </w:sdt>
+                </w:p>
+              </w:sdtContent>
+            </w:sdt>
+          </w:sdtContent>
+        </w:sdt>
       </w:sdtContent>
     </w:sdt>
     <w:p>

</xml_diff>

<commit_message>
fix(bieu-mau): Mẫu 09C trình bày như bản tự đánh giá đã nộp
- Nhận xét chung thay cho câu dẫn mục I (không in hai lần, không còn dòng chấm thừa); if:S_HAS_INTRO, if:S_SHOW_DOTS thay S_CONTENT
- Tiêu đề và dòng quý màu đen, "Quý III Năm 2026"; "Mẫu số 09C" nghiêng; họ tên in hoa; ngày sinh (DATE_OF_BIRTH)
- "Đơn vị công tác: <phòng>, <công ty>." dùng tag chung ORG_COMPANY_NAME
- Tiêu đề trục "n. Tên trục (trục n)" đậm, không thụt; dòng nhiệm vụ "- Nhiệm vụ k:", câu nối mức tách control L_LEVEL in nghiêng (AxisTaskLine)
- Điểm phần II số nguyên in gọn (30/30), số lẻ theo làm tròn
- Họ tên người tự đánh giá dưới "(Ký, ghi rõ họ tên)" (SIGNER_NAME)
- PartyMemberProfile.DateOfBirth (migration do nhánh khác bổ sung)
- Template sửa bằng tools/templates/fix_mau09c_layout.py; xem trước phía giao diện cập nhật tương ứng
</commit_message>
<xml_diff>
--- a/backend/src/CongTacDang.Infrastructure/Templates/Word/Mau_09C_BanTuDanhGia.docx
+++ b/backend/src/CongTacDang.Infrastructure/Templates/Word/Mau_09C_BanTuDanhGia.docx
@@ -61,6 +61,7 @@
             </w:pPr>
             <w:r>
               <w:rPr>
+                <w:i/>
                 <w:iCs/>
                 <w:szCs w:val="28"/>
               </w:rPr>
@@ -68,6 +69,7 @@
             </w:r>
             <w:r>
               <w:rPr>
+                <w:i/>
                 <w:iCs/>
                 <w:szCs w:val="28"/>
               </w:rPr>
@@ -75,6 +77,7 @@
             </w:r>
             <w:r>
               <w:rPr>
+                <w:i/>
                 <w:iCs/>
                 <w:szCs w:val="28"/>
               </w:rPr>
@@ -322,7 +325,6 @@
         <w:spacing w:after="0" w:line="234" w:lineRule="atLeast"/>
         <w:jc w:val="center"/>
         <w:rPr>
-          <w:color w:val="EE0000"/>
           <w:sz w:val="28"/>
           <w:szCs w:val="28"/>
           <w:lang w:val="en-US" w:eastAsia="en-US"/>
@@ -332,7 +334,6 @@
         <w:rPr>
           <w:b/>
           <w:bCs/>
-          <w:color w:val="EE0000"/>
           <w:sz w:val="28"/>
           <w:szCs w:val="28"/>
           <w:lang w:eastAsia="en-US"/>
@@ -349,7 +350,6 @@
           <w:bCs/>
           <w:i/>
           <w:iCs/>
-          <w:color w:val="EE0000"/>
           <w:sz w:val="28"/>
           <w:szCs w:val="28"/>
           <w:lang w:val="en-US" w:eastAsia="en-US"/>
@@ -361,7 +361,6 @@
           <w:bCs/>
           <w:i/>
           <w:iCs/>
-          <w:color w:val="EE0000"/>
           <w:sz w:val="28"/>
           <w:szCs w:val="28"/>
           <w:lang w:eastAsia="en-US"/>
@@ -381,7 +380,6 @@
               <w:bCs/>
               <w:i/>
               <w:iCs/>
-              <w:color w:val="EE0000"/>
               <w:sz w:val="28"/>
               <w:szCs w:val="28"/>
               <w:lang w:eastAsia="en-US"/>
@@ -396,12 +394,11 @@
           <w:bCs/>
           <w:i/>
           <w:iCs/>
-          <w:color w:val="EE0000"/>
           <w:sz w:val="28"/>
           <w:szCs w:val="28"/>
           <w:lang w:eastAsia="en-US"/>
         </w:rPr>
-        <w:t xml:space="preserve">, Năm </w:t>
+        <w:t xml:space="preserve"> Năm </w:t>
       </w:r>
       <w:sdt>
         <w:sdtPr>
@@ -416,7 +413,6 @@
               <w:bCs/>
               <w:i/>
               <w:iCs/>
-              <w:color w:val="EE0000"/>
               <w:sz w:val="28"/>
               <w:szCs w:val="28"/>
               <w:lang w:val="en-US" w:eastAsia="en-US"/>
@@ -481,7 +477,10 @@
     </w:p>
     <w:p>
       <w:pPr>
-        <w:spacing w:after="0" w:line="240" w:lineRule="auto"/>
+        <w:tabs>
+          <w:tab w:val="left" w:pos="6237"/>
+        </w:tabs>
+        <w:spacing w:after="0" w:line="264" w:lineRule="auto"/>
         <w:ind w:firstLine="709"/>
         <w:jc w:val="left"/>
         <w:rPr>
@@ -511,7 +510,7 @@
               <w:szCs w:val="28"/>
               <w:lang w:val="en-US" w:eastAsia="en-US"/>
             </w:rPr>
-            <w:t xml:space="preserve">…………………………..……..</w:t>
+            <w:t xml:space="preserve">………………………</w:t>
           </w:r>
         </w:sdtContent>
       </w:sdt>
@@ -521,7 +520,15 @@
           <w:szCs w:val="28"/>
           <w:lang w:eastAsia="en-US"/>
         </w:rPr>
-        <w:t xml:space="preserve"> Ngày </w:t>
+        <w:tab/>
+      </w:r>
+      <w:r>
+        <w:rPr>
+          <w:sz w:val="28"/>
+          <w:szCs w:val="28"/>
+          <w:lang w:eastAsia="en-US"/>
+        </w:rPr>
+        <w:t xml:space="preserve">Ngày </w:t>
       </w:r>
       <w:r>
         <w:rPr>
@@ -539,26 +546,27 @@
         </w:rPr>
         <w:t>inh: </w:t>
       </w:r>
-      <w:r>
-        <w:rPr>
-          <w:sz w:val="28"/>
-          <w:szCs w:val="28"/>
-          <w:lang w:val="en-US" w:eastAsia="en-US"/>
-        </w:rPr>
-        <w:t>…………………</w:t>
-      </w:r>
-      <w:r>
-        <w:rPr>
-          <w:sz w:val="28"/>
-          <w:szCs w:val="28"/>
-          <w:lang w:eastAsia="en-US"/>
-        </w:rPr>
-        <w:t>…..</w:t>
-      </w:r>
+      <w:sdt>
+        <w:sdtPr>
+          <w:alias w:val="DATE_OF_BIRTH"/>
+          <w:tag w:val="DATE_OF_BIRTH"/>
+          <w:id w:val="923025"/>
+        </w:sdtPr>
+        <w:sdtContent>
+          <w:r>
+            <w:rPr>
+              <w:sz w:val="28"/>
+              <w:szCs w:val="28"/>
+              <w:lang w:val="en-US" w:eastAsia="en-US"/>
+            </w:rPr>
+            <w:t xml:space="preserve">………………</w:t>
+          </w:r>
+        </w:sdtContent>
+      </w:sdt>
     </w:p>
     <w:p>
       <w:pPr>
-        <w:spacing w:after="0" w:line="240" w:lineRule="auto"/>
+        <w:spacing w:after="0" w:line="264" w:lineRule="auto"/>
         <w:ind w:firstLine="709"/>
         <w:jc w:val="left"/>
         <w:rPr>
@@ -595,7 +603,7 @@
     </w:p>
     <w:p>
       <w:pPr>
-        <w:spacing w:after="0" w:line="240" w:lineRule="auto"/>
+        <w:spacing w:after="0" w:line="264" w:lineRule="auto"/>
         <w:ind w:firstLine="709"/>
         <w:jc w:val="left"/>
         <w:rPr>
@@ -632,7 +640,7 @@
     </w:p>
     <w:p>
       <w:pPr>
-        <w:spacing w:after="0" w:line="240" w:lineRule="auto"/>
+        <w:spacing w:after="0" w:line="264" w:lineRule="auto"/>
         <w:ind w:firstLine="709"/>
         <w:jc w:val="left"/>
         <w:rPr>
@@ -669,7 +677,7 @@
     </w:p>
     <w:p>
       <w:pPr>
-        <w:spacing w:after="0" w:line="240" w:lineRule="auto"/>
+        <w:spacing w:after="0" w:line="264" w:lineRule="auto"/>
         <w:ind w:firstLine="709"/>
         <w:jc w:val="left"/>
         <w:rPr>
@@ -699,10 +707,43 @@
               <w:szCs w:val="28"/>
               <w:lang w:eastAsia="en-US"/>
             </w:rPr>
-            <w:t xml:space="preserve">……………………………...………………………………</w:t>
+            <w:t xml:space="preserve">……………………………</w:t>
           </w:r>
         </w:sdtContent>
       </w:sdt>
+      <w:r>
+        <w:rPr>
+          <w:sz w:val="28"/>
+          <w:szCs w:val="28"/>
+          <w:lang w:eastAsia="en-US"/>
+        </w:rPr>
+        <w:t xml:space="preserve">, </w:t>
+      </w:r>
+      <w:sdt>
+        <w:sdtPr>
+          <w:alias w:val="ORG_COMPANY_NAME"/>
+          <w:tag w:val="ORG_COMPANY_NAME"/>
+          <w:id w:val="923026"/>
+        </w:sdtPr>
+        <w:sdtContent>
+          <w:r>
+            <w:rPr>
+              <w:sz w:val="28"/>
+              <w:szCs w:val="28"/>
+              <w:lang w:eastAsia="en-US"/>
+            </w:rPr>
+            <w:t xml:space="preserve">…………………………………</w:t>
+          </w:r>
+        </w:sdtContent>
+      </w:sdt>
+      <w:r>
+        <w:rPr>
+          <w:sz w:val="28"/>
+          <w:szCs w:val="28"/>
+          <w:lang w:eastAsia="en-US"/>
+        </w:rPr>
+        <w:t xml:space="preserve">.</w:t>
+      </w:r>
     </w:p>
     <w:sdt>
       <w:sdtPr>
@@ -713,7 +754,7 @@
       <w:sdtContent>
         <w:p>
           <w:pPr>
-            <w:spacing w:before="120" w:after="0" w:line="240" w:lineRule="auto"/>
+            <w:spacing w:before="120" w:after="0" w:line="264" w:lineRule="auto"/>
             <w:ind w:firstLine="709"/>
             <w:rPr>
               <w:b/>
@@ -783,45 +824,18 @@
             </w:sdtContent>
           </w:sdt>
         </w:p>
-        <w:p>
-          <w:pPr>
-            <w:spacing w:after="0" w:line="240" w:lineRule="auto"/>
-            <w:ind w:firstLine="709"/>
-            <w:rPr>
-              <w:sz w:val="28"/>
-              <w:szCs w:val="28"/>
-              <w:lang w:val="en-US" w:eastAsia="en-US"/>
-            </w:rPr>
-          </w:pPr>
-          <w:sdt>
-            <w:sdtPr>
-              <w:alias w:val="S_INTRO"/>
-              <w:tag w:val="S_INTRO"/>
-              <w:id w:val="923011"/>
-            </w:sdtPr>
-            <w:sdtContent>
-              <w:r>
-                <w:rPr>
-                  <w:sz w:val="28"/>
-                  <w:szCs w:val="28"/>
-                  <w:lang w:eastAsia="en-US"/>
-                </w:rPr>
-                <w:t>Trên cơ sở nhiệm vụ được giao, cá nhân tự đánh giá về kết quả thực hiện nhiệm vụ theo quý như sau:</w:t>
-              </w:r>
-            </w:sdtContent>
-          </w:sdt>
-        </w:p>
         <w:sdt>
           <w:sdtPr>
-            <w:alias w:val="if:S_SHOW_CONTENT"/>
-            <w:tag w:val="if:S_SHOW_CONTENT"/>
-            <w:id w:val="923020"/>
+            <w:alias w:val="if:S_HAS_INTRO"/>
+            <w:tag w:val="if:S_HAS_INTRO"/>
+            <w:id w:val="923027"/>
           </w:sdtPr>
           <w:sdtContent>
             <w:p>
               <w:pPr>
-                <w:spacing w:after="0" w:line="240" w:lineRule="auto"/>
+                <w:spacing w:after="0" w:line="264" w:lineRule="auto"/>
                 <w:ind w:firstLine="709"/>
+                <w:jc w:val="both"/>
                 <w:rPr>
                   <w:sz w:val="28"/>
                   <w:szCs w:val="28"/>
@@ -830,29 +844,49 @@
               </w:pPr>
               <w:sdt>
                 <w:sdtPr>
-                  <w:alias w:val="S_CONTENT"/>
-                  <w:tag w:val="S_CONTENT"/>
-                  <w:id w:val="923012"/>
+                  <w:alias w:val="S_INTRO"/>
+                  <w:tag w:val="S_INTRO"/>
+                  <w:id w:val="923011"/>
                 </w:sdtPr>
                 <w:sdtContent>
                   <w:r>
                     <w:rPr>
                       <w:sz w:val="28"/>
                       <w:szCs w:val="28"/>
-                      <w:lang w:val="en-US" w:eastAsia="en-US"/>
-                    </w:rPr>
-                    <w:t>.</w:t>
-                  </w:r>
-                  <w:r>
-                    <w:rPr>
-                      <w:sz w:val="28"/>
-                      <w:szCs w:val="28"/>
                       <w:lang w:eastAsia="en-US"/>
                     </w:rPr>
-                    <w:t>………………………………………………………………………………..</w:t>
+                    <w:t>Trên cơ sở nhiệm vụ được giao, cá nhân tự đánh giá về kết quả thực hiện nhiệm vụ theo quý như sau:</w:t>
                   </w:r>
                 </w:sdtContent>
               </w:sdt>
+            </w:p>
+          </w:sdtContent>
+        </w:sdt>
+        <w:sdt>
+          <w:sdtPr>
+            <w:alias w:val="if:S_SHOW_DOTS"/>
+            <w:tag w:val="if:S_SHOW_DOTS"/>
+            <w:id w:val="923028"/>
+          </w:sdtPr>
+          <w:sdtContent>
+            <w:p>
+              <w:pPr>
+                <w:spacing w:after="0" w:line="264" w:lineRule="auto"/>
+                <w:ind w:firstLine="709"/>
+                <w:rPr>
+                  <w:sz w:val="28"/>
+                  <w:szCs w:val="28"/>
+                  <w:lang w:val="en-US" w:eastAsia="en-US"/>
+                </w:rPr>
+              </w:pPr>
+              <w:r>
+                <w:rPr>
+                  <w:sz w:val="28"/>
+                  <w:szCs w:val="28"/>
+                  <w:lang w:val="en-US" w:eastAsia="en-US"/>
+                </w:rPr>
+                <w:t xml:space="preserve">……………………………………………………………………………………</w:t>
+              </w:r>
             </w:p>
           </w:sdtContent>
         </w:sdt>
@@ -866,7 +900,7 @@
             <w:p>
               <w:pPr>
                 <w:spacing w:after="0" w:line="240" w:lineRule="auto"/>
-                <w:ind w:firstLine="709"/>
+                <w:jc w:val="both"/>
                 <w:rPr>
                   <w:b/>
                   <w:bCs/>
@@ -890,7 +924,7 @@
                       <w:szCs w:val="28"/>
                       <w:lang w:eastAsia="en-US"/>
                     </w:rPr>
-                    <w:t xml:space="preserve">1. Tên trục</w:t>
+                    <w:t xml:space="preserve">1. Tên trục (trục 1)</w:t>
                   </w:r>
                 </w:sdtContent>
               </w:sdt>
@@ -904,8 +938,9 @@
               <w:sdtContent>
                 <w:p>
                   <w:pPr>
-                    <w:spacing w:after="0" w:line="240" w:lineRule="auto"/>
-                    <w:ind w:firstLine="709"/>
+                    <w:spacing w:after="0" w:line="264" w:lineRule="auto"/>
+                    <w:ind w:firstLine="426"/>
+                    <w:jc w:val="both"/>
                     <w:rPr>
                       <w:sz w:val="28"/>
                       <w:szCs w:val="28"/>
@@ -925,7 +960,26 @@
                           <w:szCs w:val="28"/>
                           <w:lang w:val="en-US" w:eastAsia="en-US"/>
                         </w:rPr>
-                        <w:t xml:space="preserve">Nhiệm vụ 1: …</w:t>
+                        <w:t xml:space="preserve">- Nhiệm vụ 1: ….</w:t>
+                      </w:r>
+                    </w:sdtContent>
+                  </w:sdt>
+                  <w:sdt>
+                    <w:sdtPr>
+                      <w:alias w:val="L_LEVEL"/>
+                      <w:tag w:val="L_LEVEL"/>
+                      <w:id w:val="923029"/>
+                    </w:sdtPr>
+                    <w:sdtContent>
+                      <w:r>
+                        <w:rPr>
+                          <w:i/>
+                          <w:iCs/>
+                          <w:sz w:val="28"/>
+                          <w:szCs w:val="28"/>
+                          <w:lang w:val="en-US" w:eastAsia="en-US"/>
+                        </w:rPr>
+                        <w:t xml:space="preserve"> Tự đánh giá mức …</w:t>
                       </w:r>
                     </w:sdtContent>
                   </w:sdt>
@@ -938,7 +992,7 @@
     </w:sdt>
     <w:p>
       <w:pPr>
-        <w:spacing w:before="120" w:after="0" w:line="240" w:lineRule="auto"/>
+        <w:spacing w:before="120" w:after="0" w:line="264" w:lineRule="auto"/>
         <w:ind w:firstLine="720"/>
         <w:jc w:val="left"/>
         <w:rPr>
@@ -982,7 +1036,7 @@
     </w:p>
     <w:p>
       <w:pPr>
-        <w:spacing w:after="0" w:line="240" w:lineRule="auto"/>
+        <w:spacing w:after="0" w:line="264" w:lineRule="auto"/>
         <w:ind w:firstLine="709"/>
         <w:jc w:val="left"/>
         <w:rPr>
@@ -1009,7 +1063,7 @@
         <w:tabs>
           <w:tab w:val="right" w:pos="9214"/>
         </w:tabs>
-        <w:spacing w:after="0" w:line="240" w:lineRule="auto"/>
+        <w:spacing w:after="0" w:line="264" w:lineRule="auto"/>
         <w:ind w:firstLine="720"/>
         <w:rPr>
           <w:sz w:val="28"/>
@@ -1088,7 +1142,7 @@
         <w:tabs>
           <w:tab w:val="right" w:pos="9214"/>
         </w:tabs>
-        <w:spacing w:after="0" w:line="240" w:lineRule="auto"/>
+        <w:spacing w:after="0" w:line="264" w:lineRule="auto"/>
         <w:ind w:firstLine="720"/>
         <w:rPr>
           <w:sz w:val="28"/>
@@ -1183,7 +1237,7 @@
         <w:tabs>
           <w:tab w:val="right" w:pos="9214"/>
         </w:tabs>
-        <w:spacing w:after="0" w:line="240" w:lineRule="auto"/>
+        <w:spacing w:after="0" w:line="264" w:lineRule="auto"/>
         <w:ind w:left="5040" w:firstLine="720"/>
         <w:jc w:val="left"/>
         <w:rPr>
@@ -1246,7 +1300,7 @@
     </w:p>
     <w:p>
       <w:pPr>
-        <w:spacing w:after="0" w:line="240" w:lineRule="auto"/>
+        <w:spacing w:after="0" w:line="264" w:lineRule="auto"/>
         <w:ind w:firstLine="720"/>
         <w:jc w:val="left"/>
         <w:rPr>
@@ -1290,7 +1344,7 @@
     </w:p>
     <w:p>
       <w:pPr>
-        <w:spacing w:after="0" w:line="240" w:lineRule="auto"/>
+        <w:spacing w:after="0" w:line="264" w:lineRule="auto"/>
         <w:ind w:firstLine="720"/>
         <w:jc w:val="left"/>
         <w:rPr>
@@ -1488,6 +1542,38 @@
                 <w:szCs w:val="28"/>
                 <w:lang w:val="en-US" w:eastAsia="en-US"/>
               </w:rPr>
+            </w:pPr>
+          </w:p>
+          <w:p>
+            <w:pPr>
+              <w:spacing w:before="120" w:line="234" w:lineRule="atLeast"/>
+              <w:jc w:val="center"/>
+            </w:pPr>
+            <w:sdt>
+              <w:sdtPr>
+                <w:alias w:val="SIGNER_NAME"/>
+                <w:tag w:val="SIGNER_NAME"/>
+                <w:id w:val="923030"/>
+              </w:sdtPr>
+              <w:sdtContent>
+                <w:r>
+                  <w:rPr>
+                    <w:b/>
+                    <w:bCs/>
+                    <w:i/>
+                    <w:iCs/>
+                    <w:sz w:val="28"/>
+                    <w:szCs w:val="28"/>
+                  </w:rPr>
+                  <w:t xml:space="preserve"/>
+                </w:r>
+              </w:sdtContent>
+            </w:sdt>
+          </w:p>
+          <w:p>
+            <w:pPr>
+              <w:spacing w:before="120" w:line="234" w:lineRule="atLeast"/>
+              <w:jc w:val="center"/>
             </w:pPr>
           </w:p>
         </w:tc>

</xml_diff>

<commit_message>
fix(bieu-mau): Mẫu 09C phần đầu trang như bản chuẩn — chữ 12, căn giữa, dấu * dưới tên Chi bộ, cột cố định
</commit_message>
<xml_diff>
--- a/backend/src/CongTacDang.Infrastructure/Templates/Word/Mau_09C_BanTuDanhGia.docx
+++ b/backend/src/CongTacDang.Infrastructure/Templates/Word/Mau_09C_BanTuDanhGia.docx
@@ -15,8 +15,8 @@
     <w:tbl>
       <w:tblPr>
         <w:tblStyle w:val="TableGrid4"/>
-        <w:tblW w:w="0" w:type="auto"/>
-        <w:tblInd w:w="108" w:type="dxa"/>
+        <w:tblW w:w="10200" w:type="dxa"/>
+        <w:tblInd w:w="0" w:type="dxa"/>
         <w:tblBorders>
           <w:top w:val="none" w:color="auto" w:sz="0" w:space="0"/>
           <w:left w:val="none" w:color="auto" w:sz="0" w:space="0"/>
@@ -25,11 +25,12 @@
           <w:insideH w:val="none" w:color="auto" w:sz="0" w:space="0"/>
           <w:insideV w:val="none" w:color="auto" w:sz="0" w:space="0"/>
         </w:tblBorders>
+        <w:tblLayout w:type="fixed"/>
         <w:tblLook w:val="04A0" w:firstRow="1" w:lastRow="0" w:firstColumn="1" w:lastColumn="0" w:noHBand="0" w:noVBand="1"/>
       </w:tblPr>
       <w:tblGrid>
-        <w:gridCol w:w="4621"/>
-        <w:gridCol w:w="4626"/>
+        <w:gridCol w:w="5600"/>
+        <w:gridCol w:w="4600"/>
       </w:tblGrid>
       <w:tr>
         <w:trPr>
@@ -37,7 +38,7 @@
         </w:trPr>
         <w:tc>
           <w:tcPr>
-            <w:tcW w:w="4621" w:type="dxa"/>
+            <w:tcW w:w="5600" w:type="dxa"/>
           </w:tcPr>
           <w:p>
             <w:pPr>
@@ -49,7 +50,7 @@
         </w:tc>
         <w:tc>
           <w:tcPr>
-            <w:tcW w:w="4626" w:type="dxa"/>
+            <w:tcW w:w="4600" w:type="dxa"/>
           </w:tcPr>
           <w:p>
             <w:pPr>
@@ -89,23 +90,16 @@
       <w:tr>
         <w:tc>
           <w:tcPr>
-            <w:tcW w:w="4621" w:type="dxa"/>
+            <w:tcW w:w="5600" w:type="dxa"/>
           </w:tcPr>
           <w:p>
             <w:pPr>
-              <w:spacing w:before="120" w:line="234" w:lineRule="atLeast"/>
+              <w:spacing w:line="234" w:lineRule="atLeast"/>
+              <w:jc w:val="center"/>
               <w:rPr>
                 <w:szCs w:val="28"/>
               </w:rPr>
             </w:pPr>
-            <w:r>
-              <w:rPr>
-                <w:b/>
-                <w:bCs/>
-                <w:szCs w:val="28"/>
-              </w:rPr>
-              <w:t xml:space="preserve">  </w:t>
-            </w:r>
             <w:sdt>
               <w:sdtPr>
                 <w:alias w:val="ORG_PARTY_NAME"/>
@@ -115,7 +109,8 @@
               <w:sdtContent>
                 <w:r>
                   <w:rPr>
-                    <w:szCs w:val="28"/>
+                    <w:sz w:val="24"/>
+                    <w:szCs w:val="24"/>
                   </w:rPr>
                   <w:t xml:space="preserve">ĐẢNG BỘ…….</w:t>
                 </w:r>
@@ -124,21 +119,14 @@
           </w:p>
           <w:p>
             <w:pPr>
-              <w:spacing w:before="120" w:line="234" w:lineRule="atLeast"/>
+              <w:spacing w:line="234" w:lineRule="atLeast"/>
+              <w:jc w:val="center"/>
               <w:rPr>
                 <w:b/>
                 <w:bCs/>
                 <w:szCs w:val="28"/>
               </w:rPr>
             </w:pPr>
-            <w:r>
-              <w:rPr>
-                <w:b/>
-                <w:bCs/>
-                <w:szCs w:val="28"/>
-              </w:rPr>
-              <w:t xml:space="preserve">  </w:t>
-            </w:r>
             <w:sdt>
               <w:sdtPr>
                 <w:alias w:val="PARTY_CELL"/>
@@ -150,7 +138,8 @@
                   <w:rPr>
                     <w:b/>
                     <w:bCs/>
-                    <w:szCs w:val="28"/>
+                    <w:sz w:val="24"/>
+                    <w:szCs w:val="24"/>
                   </w:rPr>
                   <w:t xml:space="preserve">CHI BỘ……..</w:t>
                 </w:r>
@@ -159,7 +148,8 @@
           </w:p>
           <w:p>
             <w:pPr>
-              <w:spacing w:before="120" w:line="234" w:lineRule="atLeast"/>
+              <w:spacing w:line="234" w:lineRule="atLeast"/>
+              <w:jc w:val="center"/>
               <w:rPr>
                 <w:b/>
                 <w:szCs w:val="28"/>
@@ -168,15 +158,16 @@
             <w:r>
               <w:rPr>
                 <w:b/>
-                <w:szCs w:val="28"/>
+                <w:sz w:val="24"/>
+                <w:szCs w:val="24"/>
               </w:rPr>
-              <w:t xml:space="preserve">  </w:t>
+              <w:t xml:space="preserve">*</w:t>
             </w:r>
           </w:p>
         </w:tc>
         <w:tc>
           <w:tcPr>
-            <w:tcW w:w="4626" w:type="dxa"/>
+            <w:tcW w:w="4600" w:type="dxa"/>
           </w:tcPr>
           <w:p>
             <w:pPr>
@@ -190,7 +181,8 @@
               <w:rPr>
                 <w:b/>
                 <w:noProof/>
-                <w:szCs w:val="28"/>
+                <w:sz w:val="24"/>
+                <w:szCs w:val="24"/>
               </w:rPr>
               <mc:AlternateContent>
                 <mc:Choice Requires="wps">
@@ -264,7 +256,8 @@
             <w:r>
               <w:rPr>
                 <w:b/>
-                <w:szCs w:val="28"/>
+                <w:sz w:val="24"/>
+                <w:szCs w:val="24"/>
               </w:rPr>
               <w:t xml:space="preserve">  ĐẢNG CỘNG SẢN VIỆT NAM</w:t>
             </w:r>
@@ -287,7 +280,8 @@
                 <w:r>
                   <w:rPr>
                     <w:i/>
-                    <w:szCs w:val="28"/>
+                    <w:sz w:val="24"/>
+                    <w:szCs w:val="24"/>
                   </w:rPr>
                   <w:t xml:space="preserve">…...</w:t>
                 </w:r>
@@ -296,7 +290,8 @@
             <w:r>
               <w:rPr>
                 <w:i/>
-                <w:szCs w:val="28"/>
+                <w:sz w:val="24"/>
+                <w:szCs w:val="24"/>
               </w:rPr>
               <w:t xml:space="preserve">, </w:t>
             </w:r>
@@ -310,7 +305,8 @@
                 <w:r>
                   <w:rPr>
                     <w:i/>
-                    <w:szCs w:val="28"/>
+                    <w:sz w:val="24"/>
+                    <w:szCs w:val="24"/>
                   </w:rPr>
                   <w:t xml:space="preserve">ngày…… tháng… … năm……</w:t>
                 </w:r>

</xml_diff>

<commit_message>
fix(bieu-mau): 09C tên Đảng bộ đầy đủ không xuống dòng; Mẫu 10 gọn — bỏ kỳ lặp, hết dòng chấm thừa, quý La Mã, điểm in gọn, ô ☒ mức đề xuất
</commit_message>
<xml_diff>
--- a/backend/src/CongTacDang.Infrastructure/Templates/Word/Mau_09C_BanTuDanhGia.docx
+++ b/backend/src/CongTacDang.Infrastructure/Templates/Word/Mau_09C_BanTuDanhGia.docx
@@ -15,8 +15,8 @@
     <w:tbl>
       <w:tblPr>
         <w:tblStyle w:val="TableGrid4"/>
-        <w:tblW w:w="10200" w:type="dxa"/>
-        <w:tblInd w:w="0" w:type="dxa"/>
+        <w:tblW w:w="10800" w:type="dxa"/>
+        <w:tblInd w:w="-400" w:type="dxa"/>
         <w:tblBorders>
           <w:top w:val="none" w:color="auto" w:sz="0" w:space="0"/>
           <w:left w:val="none" w:color="auto" w:sz="0" w:space="0"/>
@@ -29,8 +29,8 @@
         <w:tblLook w:val="04A0" w:firstRow="1" w:lastRow="0" w:firstColumn="1" w:lastColumn="0" w:noHBand="0" w:noVBand="1"/>
       </w:tblPr>
       <w:tblGrid>
-        <w:gridCol w:w="5600"/>
-        <w:gridCol w:w="4600"/>
+        <w:gridCol w:w="6600"/>
+        <w:gridCol w:w="4200"/>
       </w:tblGrid>
       <w:tr>
         <w:trPr>
@@ -38,7 +38,7 @@
         </w:trPr>
         <w:tc>
           <w:tcPr>
-            <w:tcW w:w="5600" w:type="dxa"/>
+            <w:tcW w:w="6600" w:type="dxa"/>
           </w:tcPr>
           <w:p>
             <w:pPr>
@@ -50,7 +50,7 @@
         </w:tc>
         <w:tc>
           <w:tcPr>
-            <w:tcW w:w="4600" w:type="dxa"/>
+            <w:tcW w:w="4200" w:type="dxa"/>
           </w:tcPr>
           <w:p>
             <w:pPr>
@@ -90,7 +90,7 @@
       <w:tr>
         <w:tc>
           <w:tcPr>
-            <w:tcW w:w="5600" w:type="dxa"/>
+            <w:tcW w:w="6600" w:type="dxa"/>
           </w:tcPr>
           <w:p>
             <w:pPr>
@@ -167,7 +167,7 @@
         </w:tc>
         <w:tc>
           <w:tcPr>
-            <w:tcW w:w="4600" w:type="dxa"/>
+            <w:tcW w:w="4200" w:type="dxa"/>
           </w:tcPr>
           <w:p>
             <w:pPr>

</xml_diff>